<commit_message>
docs: adicionada imagem do diagrama BPMN 2.0 no slide 6 e relatorio tecnico
</commit_message>
<xml_diff>
--- a/docs/scripts/Semana07_Integração_Robo_Cadastro_V2.0.docx
+++ b/docs/scripts/Semana07_Integração_Robo_Cadastro_V2.0.docx
@@ -450,6 +450,58 @@
     </w:p>
     <w:p>
       <w:pPr>
+        <w:jc w:val="center"/>
+      </w:pPr>
+      <w:r>
+        <w:drawing>
+          <wp:inline xmlns:a="http://schemas.openxmlformats.org/drawingml/2006/main" xmlns:pic="http://schemas.openxmlformats.org/drawingml/2006/picture">
+            <wp:extent cx="5303520" cy="2032465"/>
+            <wp:docPr id="1" name="Picture 1"/>
+            <wp:cNvGraphicFramePr>
+              <a:graphicFrameLocks noChangeAspect="1"/>
+            </wp:cNvGraphicFramePr>
+            <a:graphic>
+              <a:graphicData uri="http://schemas.openxmlformats.org/drawingml/2006/picture">
+                <pic:pic>
+                  <pic:nvPicPr>
+                    <pic:cNvPr id="0" name="bpmn_atendimento_portal_fake.jpeg"/>
+                    <pic:cNvPicPr/>
+                  </pic:nvPicPr>
+                  <pic:blipFill>
+                    <a:blip r:embed="rId9"/>
+                    <a:stretch>
+                      <a:fillRect/>
+                    </a:stretch>
+                  </pic:blipFill>
+                  <pic:spPr>
+                    <a:xfrm>
+                      <a:off x="0" y="0"/>
+                      <a:ext cx="5303520" cy="2032465"/>
+                    </a:xfrm>
+                    <a:prstGeom prst="rect"/>
+                  </pic:spPr>
+                </pic:pic>
+              </a:graphicData>
+            </a:graphic>
+          </wp:inline>
+        </w:drawing>
+      </w:r>
+    </w:p>
+    <w:p>
+      <w:pPr>
+        <w:jc w:val="center"/>
+      </w:pPr>
+      <w:r>
+        <w:rPr>
+          <w:i/>
+          <w:color w:val="555555"/>
+          <w:sz w:val="19"/>
+        </w:rPr>
+        <w:t>Figura 1: Diagrama BPMN 2.0 do Processo 1 - Setor de Atendimento</w:t>
+      </w:r>
+    </w:p>
+    <w:p>
+      <w:pPr>
         <w:keepNext/>
         <w:spacing w:before="320" w:after="120"/>
       </w:pPr>
@@ -770,7 +822,7 @@
         <w:drawing>
           <wp:inline xmlns:a="http://schemas.openxmlformats.org/drawingml/2006/main" xmlns:pic="http://schemas.openxmlformats.org/drawingml/2006/picture">
             <wp:extent cx="4754880" cy="2039653"/>
-            <wp:docPr id="1" name="Picture 1"/>
+            <wp:docPr id="2" name="Picture 2"/>
             <wp:cNvGraphicFramePr>
               <a:graphicFrameLocks noChangeAspect="1"/>
             </wp:cNvGraphicFramePr>
@@ -782,7 +834,7 @@
                     <pic:cNvPicPr/>
                   </pic:nvPicPr>
                   <pic:blipFill>
-                    <a:blip r:embed="rId9"/>
+                    <a:blip r:embed="rId10"/>
                     <a:stretch>
                       <a:fillRect/>
                     </a:stretch>
@@ -822,7 +874,7 @@
         <w:drawing>
           <wp:inline xmlns:a="http://schemas.openxmlformats.org/drawingml/2006/main" xmlns:pic="http://schemas.openxmlformats.org/drawingml/2006/picture">
             <wp:extent cx="4754880" cy="2039653"/>
-            <wp:docPr id="2" name="Picture 2"/>
+            <wp:docPr id="3" name="Picture 3"/>
             <wp:cNvGraphicFramePr>
               <a:graphicFrameLocks noChangeAspect="1"/>
             </wp:cNvGraphicFramePr>
@@ -834,7 +886,7 @@
                     <pic:cNvPicPr/>
                   </pic:nvPicPr>
                   <pic:blipFill>
-                    <a:blip r:embed="rId10"/>
+                    <a:blip r:embed="rId11"/>
                     <a:stretch>
                       <a:fillRect/>
                     </a:stretch>
@@ -874,7 +926,7 @@
         <w:drawing>
           <wp:inline xmlns:a="http://schemas.openxmlformats.org/drawingml/2006/main" xmlns:pic="http://schemas.openxmlformats.org/drawingml/2006/picture">
             <wp:extent cx="4754880" cy="2039653"/>
-            <wp:docPr id="3" name="Picture 3"/>
+            <wp:docPr id="4" name="Picture 4"/>
             <wp:cNvGraphicFramePr>
               <a:graphicFrameLocks noChangeAspect="1"/>
             </wp:cNvGraphicFramePr>
@@ -886,7 +938,7 @@
                     <pic:cNvPicPr/>
                   </pic:nvPicPr>
                   <pic:blipFill>
-                    <a:blip r:embed="rId11"/>
+                    <a:blip r:embed="rId12"/>
                     <a:stretch>
                       <a:fillRect/>
                     </a:stretch>

</xml_diff>